<commit_message>
fix: correct signup redirects and order status access
</commit_message>
<xml_diff>
--- a/output/docx/Frostly_Complete_User_Manual_and_Workflows.docx
+++ b/output/docx/Frostly_Complete_User_Manual_and_Workflows.docx
@@ -2338,7 +2338,7 @@
         <w:spacing w:after="60"/>
       </w:pPr>
       <w:r>
-        <w:t>Configure Supabase Auth email confirmation, Site URL, and allowed redirect URLs for localhost and the live Pages domain.</w:t>
+        <w:t>Configure Supabase Auth email confirmation, set Site URL to the live Pages domain (or custom domain), and allow-list that origin plus localhost. Signup emails now redirect to the site where registration began.</w:t>
       </w:r>
     </w:p>
     <w:p>
@@ -3046,6 +3046,88 @@
                 <w:sz w:val="16"/>
               </w:rPr>
               <w:t>Apply migration 202610220014_manual_mobile_payments.sql; verify the method toggle and receiving number in Admin &gt; Settings.</w:t>
+            </w:r>
+          </w:p>
+        </w:tc>
+      </w:tr>
+      <w:tr>
+        <w:tc>
+          <w:tcPr>
+            <w:tcW w:type="dxa" w:w="2448"/>
+            <w:vAlign w:val="center"/>
+            <w:shd w:fill="F1F7F9"/>
+          </w:tcPr>
+          <w:p>
+            <w:pPr>
+              <w:spacing w:after="40" w:before="40"/>
+            </w:pPr>
+            <w:r>
+              <w:rPr>
+                <w:rFonts w:ascii="Arial" w:hAnsi="Arial"/>
+                <w:color w:val="172B3A"/>
+                <w:sz w:val="16"/>
+              </w:rPr>
+              <w:t>Signup email points to localhost or errors after clicking</w:t>
+            </w:r>
+          </w:p>
+        </w:tc>
+        <w:tc>
+          <w:tcPr>
+            <w:tcW w:type="dxa" w:w="7344"/>
+            <w:vAlign w:val="center"/>
+            <w:shd w:fill="F1F7F9"/>
+          </w:tcPr>
+          <w:p>
+            <w:pPr>
+              <w:spacing w:after="40" w:before="40"/>
+            </w:pPr>
+            <w:r>
+              <w:rPr>
+                <w:rFonts w:ascii="Arial" w:hAnsi="Arial"/>
+                <w:color w:val="172B3A"/>
+                <w:sz w:val="16"/>
+              </w:rPr>
+              <w:t>Set the Supabase Auth Site URL to the production origin and add it to Redirect URLs; signup passes the current site URL as its confirmation redirect.</w:t>
+            </w:r>
+          </w:p>
+        </w:tc>
+      </w:tr>
+      <w:tr>
+        <w:tc>
+          <w:tcPr>
+            <w:tcW w:type="dxa" w:w="2448"/>
+            <w:vAlign w:val="center"/>
+          </w:tcPr>
+          <w:p>
+            <w:pPr>
+              <w:spacing w:after="40" w:before="40"/>
+            </w:pPr>
+            <w:r>
+              <w:rPr>
+                <w:rFonts w:ascii="Arial" w:hAnsi="Arial"/>
+                <w:color w:val="172B3A"/>
+                <w:sz w:val="16"/>
+              </w:rPr>
+              <w:t>Superadmin/order manager cannot change order status</w:t>
+            </w:r>
+          </w:p>
+        </w:tc>
+        <w:tc>
+          <w:tcPr>
+            <w:tcW w:type="dxa" w:w="7344"/>
+            <w:vAlign w:val="center"/>
+          </w:tcPr>
+          <w:p>
+            <w:pPr>
+              <w:spacing w:after="40" w:before="40"/>
+            </w:pPr>
+            <w:r>
+              <w:rPr>
+                <w:rFonts w:ascii="Arial" w:hAnsi="Arial"/>
+                <w:color w:val="172B3A"/>
+                <w:sz w:val="16"/>
+              </w:rPr>
+              <w:t>Apply migration 202610240015_order_manager_status_access.sql in Supabase SQL Editor to replace the original admin-only status function.</w:t>
             </w:r>
           </w:p>
         </w:tc>
@@ -4244,6 +4326,65 @@
           </w:p>
         </w:tc>
       </w:tr>
+      <w:tr>
+        <w:tc>
+          <w:tcPr>
+            <w:tcW w:type="dxa" w:w="835"/>
+            <w:vAlign w:val="center"/>
+          </w:tcPr>
+          <w:p>
+            <w:pPr>
+              <w:spacing w:after="40" w:before="40"/>
+            </w:pPr>
+            <w:r>
+              <w:rPr>
+                <w:rFonts w:ascii="Arial" w:hAnsi="Arial"/>
+                <w:color w:val="172B3A"/>
+                <w:sz w:val="16"/>
+              </w:rPr>
+              <w:t>15</w:t>
+            </w:r>
+          </w:p>
+        </w:tc>
+        <w:tc>
+          <w:tcPr>
+            <w:tcW w:type="dxa" w:w="4248"/>
+            <w:vAlign w:val="center"/>
+          </w:tcPr>
+          <w:p>
+            <w:pPr>
+              <w:spacing w:after="40" w:before="40"/>
+            </w:pPr>
+            <w:r>
+              <w:rPr>
+                <w:rFonts w:ascii="Arial" w:hAnsi="Arial"/>
+                <w:color w:val="172B3A"/>
+                <w:sz w:val="16"/>
+              </w:rPr>
+              <w:t>202610240015_order_manager_status_access.sql</w:t>
+            </w:r>
+          </w:p>
+        </w:tc>
+        <w:tc>
+          <w:tcPr>
+            <w:tcW w:type="dxa" w:w="4709"/>
+            <w:vAlign w:val="center"/>
+          </w:tcPr>
+          <w:p>
+            <w:pPr>
+              <w:spacing w:after="40" w:before="40"/>
+            </w:pPr>
+            <w:r>
+              <w:rPr>
+                <w:rFonts w:ascii="Arial" w:hAnsi="Arial"/>
+                <w:color w:val="172B3A"/>
+                <w:sz w:val="16"/>
+              </w:rPr>
+              <w:t>Allows order managers, admins and superadmins to update valid order statuses.</w:t>
+            </w:r>
+          </w:p>
+        </w:tc>
+      </w:tr>
     </w:tbl>
     <w:p>
       <w:pPr>

</xml_diff>

<commit_message>
feat: add signup email code verification
</commit_message>
<xml_diff>
--- a/output/docx/Frostly_Complete_User_Manual_and_Workflows.docx
+++ b/output/docx/Frostly_Complete_User_Manual_and_Workflows.docx
@@ -2338,7 +2338,7 @@
         <w:spacing w:after="60"/>
       </w:pPr>
       <w:r>
-        <w:t>Configure Supabase Auth email confirmation, set Site URL to the live Pages domain (or custom domain), and allow-list that origin plus localhost. Signup emails now redirect to the site where registration began.</w:t>
+        <w:t>Configure Supabase Auth: set Site URL to the live Pages domain (or custom domain), allow-list the production and local URLs, then set the Confirm signup template to include {{ .Token }} and omit {{ .ConfirmationURL }}. Frostly displays a six-digit code-entry screen; link-based Auth emails use the current site redirect.</w:t>
       </w:r>
     </w:p>
     <w:p>
@@ -3067,7 +3067,7 @@
                 <w:color w:val="172B3A"/>
                 <w:sz w:val="16"/>
               </w:rPr>
-              <w:t>Signup email points to localhost or errors after clicking</w:t>
+              <w:t>Password reset or another Auth link points to localhost</w:t>
             </w:r>
           </w:p>
         </w:tc>
@@ -3087,7 +3087,7 @@
                 <w:color w:val="172B3A"/>
                 <w:sz w:val="16"/>
               </w:rPr>
-              <w:t>Set the Supabase Auth Site URL to the production origin and add it to Redirect URLs; signup passes the current site URL as its confirmation redirect.</w:t>
+              <w:t>Set the Supabase Auth Site URL to the production origin and add the production URL to Redirect URLs. Signup is code-based when the Confirm signup template uses {{ .Token }}.</w:t>
             </w:r>
           </w:p>
         </w:tc>
@@ -3108,6 +3108,47 @@
                 <w:color w:val="172B3A"/>
                 <w:sz w:val="16"/>
               </w:rPr>
+              <w:t>Signup verification code is missing</w:t>
+            </w:r>
+          </w:p>
+        </w:tc>
+        <w:tc>
+          <w:tcPr>
+            <w:tcW w:type="dxa" w:w="7344"/>
+            <w:vAlign w:val="center"/>
+          </w:tcPr>
+          <w:p>
+            <w:pPr>
+              <w:spacing w:after="40" w:before="40"/>
+            </w:pPr>
+            <w:r>
+              <w:rPr>
+                <w:rFonts w:ascii="Arial" w:hAnsi="Arial"/>
+                <w:color w:val="172B3A"/>
+                <w:sz w:val="16"/>
+              </w:rPr>
+              <w:t>In Supabase Auth &gt; Email Templates &gt; Confirm signup, use {{ .Token }} instead of {{ .ConfirmationURL }}; test with a new email because old confirmation messages are unchanged.</w:t>
+            </w:r>
+          </w:p>
+        </w:tc>
+      </w:tr>
+      <w:tr>
+        <w:tc>
+          <w:tcPr>
+            <w:tcW w:type="dxa" w:w="2448"/>
+            <w:vAlign w:val="center"/>
+            <w:shd w:fill="F1F7F9"/>
+          </w:tcPr>
+          <w:p>
+            <w:pPr>
+              <w:spacing w:after="40" w:before="40"/>
+            </w:pPr>
+            <w:r>
+              <w:rPr>
+                <w:rFonts w:ascii="Arial" w:hAnsi="Arial"/>
+                <w:color w:val="172B3A"/>
+                <w:sz w:val="16"/>
+              </w:rPr>
               <w:t>Superadmin/order manager cannot change order status</w:t>
             </w:r>
           </w:p>
@@ -3116,6 +3157,7 @@
           <w:tcPr>
             <w:tcW w:type="dxa" w:w="7344"/>
             <w:vAlign w:val="center"/>
+            <w:shd w:fill="F1F7F9"/>
           </w:tcPr>
           <w:p>
             <w:pPr>
@@ -3137,7 +3179,6 @@
           <w:tcPr>
             <w:tcW w:type="dxa" w:w="2448"/>
             <w:vAlign w:val="center"/>
-            <w:shd w:fill="F1F7F9"/>
           </w:tcPr>
           <w:p>
             <w:pPr>
@@ -3157,7 +3198,6 @@
           <w:tcPr>
             <w:tcW w:type="dxa" w:w="7344"/>
             <w:vAlign w:val="center"/>
-            <w:shd w:fill="F1F7F9"/>
           </w:tcPr>
           <w:p>
             <w:pPr>
@@ -3179,6 +3219,7 @@
           <w:tcPr>
             <w:tcW w:type="dxa" w:w="2448"/>
             <w:vAlign w:val="center"/>
+            <w:shd w:fill="F1F7F9"/>
           </w:tcPr>
           <w:p>
             <w:pPr>
@@ -3198,6 +3239,7 @@
           <w:tcPr>
             <w:tcW w:type="dxa" w:w="7344"/>
             <w:vAlign w:val="center"/>
+            <w:shd w:fill="F1F7F9"/>
           </w:tcPr>
           <w:p>
             <w:pPr>
@@ -3219,7 +3261,6 @@
           <w:tcPr>
             <w:tcW w:type="dxa" w:w="2448"/>
             <w:vAlign w:val="center"/>
-            <w:shd w:fill="F1F7F9"/>
           </w:tcPr>
           <w:p>
             <w:pPr>
@@ -3239,7 +3280,6 @@
           <w:tcPr>
             <w:tcW w:type="dxa" w:w="7344"/>
             <w:vAlign w:val="center"/>
-            <w:shd w:fill="F1F7F9"/>
           </w:tcPr>
           <w:p>
             <w:pPr>
@@ -3261,6 +3301,7 @@
           <w:tcPr>
             <w:tcW w:type="dxa" w:w="2448"/>
             <w:vAlign w:val="center"/>
+            <w:shd w:fill="F1F7F9"/>
           </w:tcPr>
           <w:p>
             <w:pPr>
@@ -3280,6 +3321,7 @@
           <w:tcPr>
             <w:tcW w:type="dxa" w:w="7344"/>
             <w:vAlign w:val="center"/>
+            <w:shd w:fill="F1F7F9"/>
           </w:tcPr>
           <w:p>
             <w:pPr>
@@ -3301,7 +3343,6 @@
           <w:tcPr>
             <w:tcW w:type="dxa" w:w="2448"/>
             <w:vAlign w:val="center"/>
-            <w:shd w:fill="F1F7F9"/>
           </w:tcPr>
           <w:p>
             <w:pPr>
@@ -3321,7 +3362,6 @@
           <w:tcPr>
             <w:tcW w:type="dxa" w:w="7344"/>
             <w:vAlign w:val="center"/>
-            <w:shd w:fill="F1F7F9"/>
           </w:tcPr>
           <w:p>
             <w:pPr>
@@ -3343,6 +3383,7 @@
           <w:tcPr>
             <w:tcW w:type="dxa" w:w="2448"/>
             <w:vAlign w:val="center"/>
+            <w:shd w:fill="F1F7F9"/>
           </w:tcPr>
           <w:p>
             <w:pPr>
@@ -3362,6 +3403,7 @@
           <w:tcPr>
             <w:tcW w:type="dxa" w:w="7344"/>
             <w:vAlign w:val="center"/>
+            <w:shd w:fill="F1F7F9"/>
           </w:tcPr>
           <w:p>
             <w:pPr>

</xml_diff>

<commit_message>
revert: restore signup confirmation links
</commit_message>
<xml_diff>
--- a/output/docx/Frostly_Complete_User_Manual_and_Workflows.docx
+++ b/output/docx/Frostly_Complete_User_Manual_and_Workflows.docx
@@ -2338,7 +2338,7 @@
         <w:spacing w:after="60"/>
       </w:pPr>
       <w:r>
-        <w:t>Configure Supabase Auth: set Site URL to the live Pages domain (or custom domain), allow-list the production and local URLs, then set the Confirm signup template to include {{ .Token }} and omit {{ .ConfirmationURL }}. Frostly displays a six-digit code-entry screen; link-based Auth emails use the current site redirect.</w:t>
+        <w:t>Configure Supabase Auth: set Site URL to the live Pages domain (or custom domain), allow-list the production root and local URLs, and make sure Confirm signup uses a link with {{ .ConfirmationURL }}. Frostly signup directs the verification link to the current site root.</w:t>
       </w:r>
     </w:p>
     <w:p>
@@ -3067,7 +3067,7 @@
                 <w:color w:val="172B3A"/>
                 <w:sz w:val="16"/>
               </w:rPr>
-              <w:t>Password reset or another Auth link points to localhost</w:t>
+              <w:t>Signup confirmation code appears instead of a link</w:t>
             </w:r>
           </w:p>
         </w:tc>
@@ -3087,7 +3087,7 @@
                 <w:color w:val="172B3A"/>
                 <w:sz w:val="16"/>
               </w:rPr>
-              <w:t>Set the Supabase Auth Site URL to the production origin and add the production URL to Redirect URLs. Signup is code-based when the Confirm signup template uses {{ .Token }}.</w:t>
+              <w:t>In Supabase Auth &gt; Email Templates &gt; Confirm signup, restore a link using {{ .ConfirmationURL }} and request a new confirmation email.</w:t>
             </w:r>
           </w:p>
         </w:tc>
@@ -3108,7 +3108,7 @@
                 <w:color w:val="172B3A"/>
                 <w:sz w:val="16"/>
               </w:rPr>
-              <w:t>Signup verification code is missing</w:t>
+              <w:t>Auth email link points to localhost</w:t>
             </w:r>
           </w:p>
         </w:tc>
@@ -3127,7 +3127,7 @@
                 <w:color w:val="172B3A"/>
                 <w:sz w:val="16"/>
               </w:rPr>
-              <w:t>In Supabase Auth &gt; Email Templates &gt; Confirm signup, use {{ .Token }} instead of {{ .ConfirmationURL }}; test with a new email because old confirmation messages are unchanged.</w:t>
+              <w:t>Set the Supabase Auth Site URL to the production origin and allow-list the production root URL. Signup redirects to the current site root.</w:t>
             </w:r>
           </w:p>
         </w:tc>

</xml_diff>